<commit_message>
main and order pages summarized
</commit_message>
<xml_diff>
--- a/summary.docx
+++ b/summary.docx
@@ -6,27 +6,219 @@
       <w:pPr>
         <w:pStyle w:val="Title"/>
         <w:jc w:val="center"/>
+        <w:rPr>
+          <w:sz w:val="52"/>
+          <w:szCs w:val="52"/>
+        </w:rPr>
       </w:pPr>
       <w:r>
+        <w:rPr>
+          <w:sz w:val="52"/>
+          <w:szCs w:val="52"/>
+        </w:rPr>
         <w:t>Pizza House Summary</w:t>
-      </w:r>
-    </w:p>
-    <w:p>
-      <w:r>
-        <w:t>For tasks completion we needed to come up with idea of the website. It was decided to make a website for restaurant called “Pizza House”, where people can see the menu, make an order and make a table reservation. With idea of making a restaurant website it is possible to implement all the tasks that we need.</w:t>
       </w:r>
     </w:p>
     <w:p>
       <w:pPr>
         <w:rPr>
-          <w:rStyle w:val="Strong"/>
+          <w:sz w:val="22"/>
+          <w:szCs w:val="22"/>
         </w:rPr>
       </w:pPr>
       <w:r>
         <w:rPr>
-          <w:rStyle w:val="Strong"/>
-        </w:rPr>
-        <w:t>Main Page</w:t>
+          <w:sz w:val="22"/>
+          <w:szCs w:val="22"/>
+        </w:rPr>
+        <w:t>To complete the tasks</w:t>
+      </w:r>
+      <w:r>
+        <w:rPr>
+          <w:sz w:val="22"/>
+          <w:szCs w:val="22"/>
+        </w:rPr>
+        <w:t xml:space="preserve"> we needed to come up with </w:t>
+      </w:r>
+      <w:r>
+        <w:rPr>
+          <w:sz w:val="22"/>
+          <w:szCs w:val="22"/>
+        </w:rPr>
+        <w:t xml:space="preserve">an </w:t>
+      </w:r>
+      <w:r>
+        <w:rPr>
+          <w:sz w:val="22"/>
+          <w:szCs w:val="22"/>
+        </w:rPr>
+        <w:t xml:space="preserve">idea of </w:t>
+      </w:r>
+      <w:r>
+        <w:rPr>
+          <w:sz w:val="22"/>
+          <w:szCs w:val="22"/>
+        </w:rPr>
+        <w:t xml:space="preserve">a </w:t>
+      </w:r>
+      <w:r>
+        <w:rPr>
+          <w:sz w:val="22"/>
+          <w:szCs w:val="22"/>
+        </w:rPr>
+        <w:t xml:space="preserve">website. </w:t>
+      </w:r>
+      <w:r>
+        <w:rPr>
+          <w:sz w:val="22"/>
+          <w:szCs w:val="22"/>
+        </w:rPr>
+        <w:t>We</w:t>
+      </w:r>
+      <w:r>
+        <w:rPr>
+          <w:sz w:val="22"/>
+          <w:szCs w:val="22"/>
+        </w:rPr>
+        <w:t xml:space="preserve"> decided to </w:t>
+      </w:r>
+      <w:r>
+        <w:rPr>
+          <w:sz w:val="22"/>
+          <w:szCs w:val="22"/>
+        </w:rPr>
+        <w:t xml:space="preserve">create </w:t>
+      </w:r>
+      <w:r>
+        <w:rPr>
+          <w:sz w:val="22"/>
+          <w:szCs w:val="22"/>
+        </w:rPr>
+        <w:t xml:space="preserve">a website for </w:t>
+      </w:r>
+      <w:r>
+        <w:rPr>
+          <w:sz w:val="22"/>
+          <w:szCs w:val="22"/>
+        </w:rPr>
+        <w:t xml:space="preserve">a </w:t>
+      </w:r>
+      <w:r>
+        <w:rPr>
+          <w:sz w:val="22"/>
+          <w:szCs w:val="22"/>
+        </w:rPr>
+        <w:t>restaurant called “</w:t>
+      </w:r>
+      <w:r>
+        <w:rPr>
+          <w:b/>
+          <w:bCs/>
+          <w:sz w:val="22"/>
+          <w:szCs w:val="22"/>
+        </w:rPr>
+        <w:t>Pizza House</w:t>
+      </w:r>
+      <w:r>
+        <w:rPr>
+          <w:sz w:val="22"/>
+          <w:szCs w:val="22"/>
+        </w:rPr>
+        <w:t xml:space="preserve">”, where people can make an order </w:t>
+      </w:r>
+      <w:r>
+        <w:rPr>
+          <w:sz w:val="22"/>
+          <w:szCs w:val="22"/>
+        </w:rPr>
+        <w:t xml:space="preserve">or </w:t>
+      </w:r>
+      <w:r>
+        <w:rPr>
+          <w:sz w:val="22"/>
+          <w:szCs w:val="22"/>
+        </w:rPr>
+        <w:t xml:space="preserve">make a table reservation. With </w:t>
+      </w:r>
+      <w:r>
+        <w:rPr>
+          <w:sz w:val="22"/>
+          <w:szCs w:val="22"/>
+        </w:rPr>
+        <w:t xml:space="preserve">this idea, </w:t>
+      </w:r>
+      <w:r>
+        <w:rPr>
+          <w:sz w:val="22"/>
+          <w:szCs w:val="22"/>
+        </w:rPr>
+        <w:t xml:space="preserve">it is possible to implement all the </w:t>
+      </w:r>
+      <w:r>
+        <w:rPr>
+          <w:sz w:val="22"/>
+          <w:szCs w:val="22"/>
+        </w:rPr>
+        <w:t>tasks.</w:t>
+      </w:r>
+      <w:r>
+        <w:rPr>
+          <w:sz w:val="22"/>
+          <w:szCs w:val="22"/>
+        </w:rPr>
+        <w:t xml:space="preserve"> We split the work as follows: </w:t>
+      </w:r>
+      <w:r>
+        <w:rPr>
+          <w:b/>
+          <w:bCs/>
+          <w:sz w:val="22"/>
+          <w:szCs w:val="22"/>
+        </w:rPr>
+        <w:t>Samuel – Main page and order page</w:t>
+      </w:r>
+      <w:r>
+        <w:rPr>
+          <w:sz w:val="22"/>
+          <w:szCs w:val="22"/>
+        </w:rPr>
+        <w:t xml:space="preserve">; </w:t>
+      </w:r>
+      <w:proofErr w:type="spellStart"/>
+      <w:r>
+        <w:rPr>
+          <w:b/>
+          <w:bCs/>
+          <w:sz w:val="22"/>
+          <w:szCs w:val="22"/>
+        </w:rPr>
+        <w:t>Arjtom</w:t>
+      </w:r>
+      <w:proofErr w:type="spellEnd"/>
+      <w:r>
+        <w:rPr>
+          <w:b/>
+          <w:bCs/>
+          <w:sz w:val="22"/>
+          <w:szCs w:val="22"/>
+        </w:rPr>
+        <w:t xml:space="preserve"> – Reservation page</w:t>
+      </w:r>
+      <w:r>
+        <w:rPr>
+          <w:b/>
+          <w:bCs/>
+          <w:sz w:val="22"/>
+          <w:szCs w:val="22"/>
+        </w:rPr>
+        <w:t xml:space="preserve">. </w:t>
+      </w:r>
+      <w:r>
+        <w:rPr>
+          <w:sz w:val="22"/>
+          <w:szCs w:val="22"/>
+        </w:rPr>
+        <w:t>We have tested each other’s work and read through the code to understand it.</w:t>
       </w:r>
     </w:p>
     <w:p>
@@ -35,35 +227,179 @@
           <w:rStyle w:val="Strong"/>
         </w:rPr>
       </w:pPr>
+      <w:r>
+        <w:rPr>
+          <w:rStyle w:val="Strong"/>
+        </w:rPr>
+        <w:t>Main Page</w:t>
+      </w:r>
     </w:p>
     <w:p>
       <w:pPr>
         <w:rPr>
           <w:rStyle w:val="Strong"/>
+          <w:b w:val="0"/>
+          <w:bCs w:val="0"/>
+          <w:sz w:val="22"/>
+          <w:szCs w:val="22"/>
         </w:rPr>
       </w:pPr>
       <w:r>
         <w:rPr>
           <w:rStyle w:val="Strong"/>
-        </w:rPr>
-        <w:t>Reservation page</w:t>
+          <w:b w:val="0"/>
+          <w:bCs w:val="0"/>
+          <w:sz w:val="22"/>
+          <w:szCs w:val="22"/>
+        </w:rPr>
+        <w:t xml:space="preserve">Main page allows the user to choose what page they want to go to through the navigation menu. This page shows a food related quote in the middle. The quote is randomly accessed from an </w:t>
+      </w:r>
+      <w:hyperlink r:id="rId4" w:history="1">
+        <w:r>
+          <w:rPr>
+            <w:rStyle w:val="Hyperlink"/>
+            <w:sz w:val="22"/>
+            <w:szCs w:val="22"/>
+          </w:rPr>
+          <w:t>API server</w:t>
+        </w:r>
+      </w:hyperlink>
+      <w:r>
+        <w:rPr>
+          <w:rStyle w:val="Strong"/>
+          <w:b w:val="0"/>
+          <w:bCs w:val="0"/>
+          <w:sz w:val="22"/>
+          <w:szCs w:val="22"/>
+        </w:rPr>
+        <w:t xml:space="preserve"> with the use of </w:t>
+      </w:r>
+      <w:r>
+        <w:rPr>
+          <w:rStyle w:val="Strong"/>
+          <w:rFonts w:ascii="Consolas" w:hAnsi="Consolas"/>
+          <w:b w:val="0"/>
+          <w:bCs w:val="0"/>
+          <w:sz w:val="22"/>
+          <w:szCs w:val="22"/>
+        </w:rPr>
+        <w:t>fetch()</w:t>
+      </w:r>
+      <w:r>
+        <w:rPr>
+          <w:rStyle w:val="Strong"/>
+          <w:b w:val="0"/>
+          <w:bCs w:val="0"/>
+          <w:sz w:val="22"/>
+          <w:szCs w:val="22"/>
+        </w:rPr>
+        <w:t xml:space="preserve"> function</w:t>
+      </w:r>
+      <w:r>
+        <w:rPr>
+          <w:rStyle w:val="Strong"/>
+          <w:b w:val="0"/>
+          <w:bCs w:val="0"/>
+          <w:sz w:val="22"/>
+          <w:szCs w:val="22"/>
+        </w:rPr>
+        <w:t>. As it is an asynchronous function</w:t>
+      </w:r>
+      <w:r>
+        <w:rPr>
+          <w:rStyle w:val="Strong"/>
+          <w:b w:val="0"/>
+          <w:bCs w:val="0"/>
+          <w:sz w:val="22"/>
+          <w:szCs w:val="22"/>
+        </w:rPr>
+        <w:t>,</w:t>
+      </w:r>
+      <w:r>
+        <w:rPr>
+          <w:rStyle w:val="Strong"/>
+          <w:b w:val="0"/>
+          <w:bCs w:val="0"/>
+          <w:sz w:val="22"/>
+          <w:szCs w:val="22"/>
+        </w:rPr>
+        <w:t xml:space="preserve"> </w:t>
+      </w:r>
+      <w:r>
+        <w:rPr>
+          <w:rStyle w:val="Strong"/>
+          <w:rFonts w:ascii="Consolas" w:hAnsi="Consolas"/>
+          <w:b w:val="0"/>
+          <w:bCs w:val="0"/>
+          <w:sz w:val="22"/>
+          <w:szCs w:val="22"/>
+        </w:rPr>
+        <w:t>then()</w:t>
+      </w:r>
+      <w:r>
+        <w:rPr>
+          <w:rStyle w:val="Strong"/>
+          <w:b w:val="0"/>
+          <w:bCs w:val="0"/>
+          <w:sz w:val="22"/>
+          <w:szCs w:val="22"/>
+        </w:rPr>
+        <w:t xml:space="preserve"> and </w:t>
+      </w:r>
+      <w:r>
+        <w:rPr>
+          <w:rStyle w:val="Strong"/>
+          <w:rFonts w:ascii="Consolas" w:hAnsi="Consolas"/>
+          <w:b w:val="0"/>
+          <w:bCs w:val="0"/>
+          <w:sz w:val="22"/>
+          <w:szCs w:val="22"/>
+        </w:rPr>
+        <w:t>finally()</w:t>
+      </w:r>
+      <w:r>
+        <w:rPr>
+          <w:rStyle w:val="Strong"/>
+          <w:rFonts w:ascii="Consolas" w:hAnsi="Consolas"/>
+          <w:b w:val="0"/>
+          <w:bCs w:val="0"/>
+          <w:sz w:val="22"/>
+          <w:szCs w:val="22"/>
+        </w:rPr>
+        <w:t xml:space="preserve"> </w:t>
+      </w:r>
+      <w:r>
+        <w:rPr>
+          <w:rStyle w:val="Strong"/>
+          <w:b w:val="0"/>
+          <w:bCs w:val="0"/>
+          <w:sz w:val="22"/>
+          <w:szCs w:val="22"/>
+        </w:rPr>
+        <w:t xml:space="preserve">were also used to achieve the desired </w:t>
+      </w:r>
+      <w:r>
+        <w:rPr>
+          <w:rStyle w:val="Strong"/>
+          <w:b w:val="0"/>
+          <w:bCs w:val="0"/>
+          <w:sz w:val="22"/>
+          <w:szCs w:val="22"/>
+        </w:rPr>
+        <w:t>outcome.</w:t>
       </w:r>
     </w:p>
     <w:p>
       <w:pPr>
         <w:rPr>
           <w:rStyle w:val="Strong"/>
-          <w:b w:val="0"/>
-          <w:bCs w:val="0"/>
         </w:rPr>
       </w:pPr>
       <w:r>
         <w:rPr>
           <w:rStyle w:val="Strong"/>
-          <w:b w:val="0"/>
-          <w:bCs w:val="0"/>
-        </w:rPr>
-        <w:t xml:space="preserve">Reservation page consists of input fields, where user should input own data. After inputting data, user can select the time, and after time selection user will be notified, that table has been reserved, and user can see own input data. User cannot make a reservation without input data. </w:t>
+        </w:rPr>
+        <w:t>Reservation page</w:t>
       </w:r>
     </w:p>
     <w:p>
@@ -72,6 +408,8 @@
           <w:rStyle w:val="Strong"/>
           <w:b w:val="0"/>
           <w:bCs w:val="0"/>
+          <w:sz w:val="22"/>
+          <w:szCs w:val="22"/>
         </w:rPr>
       </w:pPr>
       <w:r>
@@ -79,16 +417,50 @@
           <w:rStyle w:val="Strong"/>
           <w:b w:val="0"/>
           <w:bCs w:val="0"/>
-        </w:rPr>
-        <w:t xml:space="preserve">For convenient person data handling, it was implemented an OOP and objects. </w:t>
-      </w:r>
-      <w:r>
-        <w:rPr>
-          <w:rStyle w:val="Strong"/>
-          <w:b w:val="0"/>
-          <w:bCs w:val="0"/>
-        </w:rPr>
-        <w:t>Person class was created with parameters name, email, phone, date, time, guests for creating a newPerson object with input values.</w:t>
+          <w:sz w:val="22"/>
+          <w:szCs w:val="22"/>
+        </w:rPr>
+        <w:t xml:space="preserve">Reservation page consists of input fields, where user should input </w:t>
+      </w:r>
+      <w:r>
+        <w:rPr>
+          <w:rStyle w:val="Strong"/>
+          <w:b w:val="0"/>
+          <w:bCs w:val="0"/>
+          <w:sz w:val="22"/>
+          <w:szCs w:val="22"/>
+        </w:rPr>
+        <w:t>their</w:t>
+      </w:r>
+      <w:r>
+        <w:rPr>
+          <w:rStyle w:val="Strong"/>
+          <w:b w:val="0"/>
+          <w:bCs w:val="0"/>
+          <w:sz w:val="22"/>
+          <w:szCs w:val="22"/>
+        </w:rPr>
+        <w:t xml:space="preserve"> data. After inputting data, user can select the time, and after time selection user will be notified, that table has been reserved, and user can see </w:t>
+      </w:r>
+      <w:r>
+        <w:rPr>
+          <w:rStyle w:val="Strong"/>
+          <w:b w:val="0"/>
+          <w:bCs w:val="0"/>
+          <w:sz w:val="22"/>
+          <w:szCs w:val="22"/>
+        </w:rPr>
+        <w:t xml:space="preserve">their own </w:t>
+      </w:r>
+      <w:r>
+        <w:rPr>
+          <w:rStyle w:val="Strong"/>
+          <w:b w:val="0"/>
+          <w:bCs w:val="0"/>
+          <w:sz w:val="22"/>
+          <w:szCs w:val="22"/>
+        </w:rPr>
+        <w:t xml:space="preserve">input data. User cannot make a reservation without input data. </w:t>
       </w:r>
     </w:p>
     <w:p>
@@ -97,6 +469,8 @@
           <w:rStyle w:val="Strong"/>
           <w:b w:val="0"/>
           <w:bCs w:val="0"/>
+          <w:sz w:val="22"/>
+          <w:szCs w:val="22"/>
         </w:rPr>
       </w:pPr>
       <w:r>
@@ -104,8 +478,40 @@
           <w:rStyle w:val="Strong"/>
           <w:b w:val="0"/>
           <w:bCs w:val="0"/>
-        </w:rPr>
-        <w:t>Available times for table reservations are stored in array called tableTimes. Available times are only 18:00, 19:00, 20:00 and 21:00.</w:t>
+          <w:sz w:val="22"/>
+          <w:szCs w:val="22"/>
+        </w:rPr>
+        <w:t>For convenient person data handling,</w:t>
+      </w:r>
+      <w:r>
+        <w:rPr>
+          <w:rStyle w:val="Strong"/>
+          <w:b w:val="0"/>
+          <w:bCs w:val="0"/>
+          <w:sz w:val="22"/>
+          <w:szCs w:val="22"/>
+        </w:rPr>
+        <w:t xml:space="preserve"> OOP was used</w:t>
+      </w:r>
+      <w:r>
+        <w:rPr>
+          <w:rStyle w:val="Strong"/>
+          <w:b w:val="0"/>
+          <w:bCs w:val="0"/>
+          <w:sz w:val="22"/>
+          <w:szCs w:val="22"/>
+        </w:rPr>
+        <w:t xml:space="preserve">. </w:t>
+      </w:r>
+      <w:r>
+        <w:rPr>
+          <w:rStyle w:val="Strong"/>
+          <w:b w:val="0"/>
+          <w:bCs w:val="0"/>
+          <w:sz w:val="22"/>
+          <w:szCs w:val="22"/>
+        </w:rPr>
+        <w:t>Person class was created with parameters name, email, phone, date, time, guests for creating a newPerson object with input values.</w:t>
       </w:r>
     </w:p>
     <w:p>
@@ -114,6 +520,8 @@
           <w:rStyle w:val="Strong"/>
           <w:b w:val="0"/>
           <w:bCs w:val="0"/>
+          <w:sz w:val="22"/>
+          <w:szCs w:val="22"/>
         </w:rPr>
       </w:pPr>
       <w:r>
@@ -121,8 +529,10 @@
           <w:rStyle w:val="Strong"/>
           <w:b w:val="0"/>
           <w:bCs w:val="0"/>
-        </w:rPr>
-        <w:t xml:space="preserve">It was also implemented several functions for executing code more conveniently. </w:t>
+          <w:sz w:val="22"/>
+          <w:szCs w:val="22"/>
+        </w:rPr>
+        <w:t xml:space="preserve">Available times for table reservations are stored in array called tableTimes. </w:t>
       </w:r>
     </w:p>
     <w:p>
@@ -131,6 +541,8 @@
           <w:rStyle w:val="Strong"/>
           <w:b w:val="0"/>
           <w:bCs w:val="0"/>
+          <w:sz w:val="22"/>
+          <w:szCs w:val="22"/>
         </w:rPr>
       </w:pPr>
       <w:r>
@@ -138,6 +550,8 @@
           <w:rStyle w:val="Strong"/>
           <w:b w:val="0"/>
           <w:bCs w:val="0"/>
+          <w:sz w:val="22"/>
+          <w:szCs w:val="22"/>
         </w:rPr>
         <w:t>F</w:t>
       </w:r>
@@ -146,30 +560,40 @@
           <w:rStyle w:val="Strong"/>
           <w:b w:val="0"/>
           <w:bCs w:val="0"/>
-        </w:rPr>
-        <w:t xml:space="preserve">unction returnTimes() </w:t>
-      </w:r>
-      <w:r>
-        <w:rPr>
-          <w:rStyle w:val="Strong"/>
-          <w:b w:val="0"/>
-          <w:bCs w:val="0"/>
-        </w:rPr>
-        <w:t>iterates over the available times and returns the table times</w:t>
-      </w:r>
-      <w:r>
-        <w:rPr>
-          <w:rStyle w:val="Strong"/>
-          <w:b w:val="0"/>
-          <w:bCs w:val="0"/>
-        </w:rPr>
-        <w:t xml:space="preserve"> using DOM Manipulation. It checks if values are filled, then </w:t>
-      </w:r>
-      <w:r>
-        <w:rPr>
-          <w:rStyle w:val="Strong"/>
-          <w:b w:val="0"/>
-          <w:bCs w:val="0"/>
+          <w:sz w:val="22"/>
+          <w:szCs w:val="22"/>
+        </w:rPr>
+        <w:t xml:space="preserve">unction </w:t>
+      </w:r>
+      <w:proofErr w:type="spellStart"/>
+      <w:r>
+        <w:rPr>
+          <w:rStyle w:val="Strong"/>
+          <w:b w:val="0"/>
+          <w:bCs w:val="0"/>
+          <w:sz w:val="22"/>
+          <w:szCs w:val="22"/>
+        </w:rPr>
+        <w:t>returnTimes</w:t>
+      </w:r>
+      <w:proofErr w:type="spellEnd"/>
+      <w:r>
+        <w:rPr>
+          <w:rStyle w:val="Strong"/>
+          <w:b w:val="0"/>
+          <w:bCs w:val="0"/>
+          <w:sz w:val="22"/>
+          <w:szCs w:val="22"/>
+        </w:rPr>
+        <w:t xml:space="preserve">() iterates over the available times and returns the table times using DOM Manipulation. It checks if values are filled, then </w:t>
+      </w:r>
+      <w:r>
+        <w:rPr>
+          <w:rStyle w:val="Strong"/>
+          <w:b w:val="0"/>
+          <w:bCs w:val="0"/>
+          <w:sz w:val="22"/>
+          <w:szCs w:val="22"/>
         </w:rPr>
         <w:t xml:space="preserve">returns </w:t>
       </w:r>
@@ -178,6 +602,8 @@
           <w:rStyle w:val="Strong"/>
           <w:b w:val="0"/>
           <w:bCs w:val="0"/>
+          <w:sz w:val="22"/>
+          <w:szCs w:val="22"/>
         </w:rPr>
         <w:t xml:space="preserve">the available times for reservation, they </w:t>
       </w:r>
@@ -186,6 +612,8 @@
           <w:rStyle w:val="Strong"/>
           <w:b w:val="0"/>
           <w:bCs w:val="0"/>
+          <w:sz w:val="22"/>
+          <w:szCs w:val="22"/>
         </w:rPr>
         <w:t>return</w:t>
       </w:r>
@@ -194,6 +622,8 @@
           <w:rStyle w:val="Strong"/>
           <w:b w:val="0"/>
           <w:bCs w:val="0"/>
+          <w:sz w:val="22"/>
+          <w:szCs w:val="22"/>
         </w:rPr>
         <w:t xml:space="preserve"> as buttons, which executes function reserveTable() with parameter “time”, this parameter value depends on which time user chose. For loop was used for iterating over tableTimes array.</w:t>
       </w:r>
@@ -204,6 +634,8 @@
           <w:rStyle w:val="Strong"/>
           <w:b w:val="0"/>
           <w:bCs w:val="0"/>
+          <w:sz w:val="22"/>
+          <w:szCs w:val="22"/>
         </w:rPr>
       </w:pPr>
       <w:r>
@@ -211,6 +643,8 @@
           <w:rStyle w:val="Strong"/>
           <w:b w:val="0"/>
           <w:bCs w:val="0"/>
+          <w:sz w:val="22"/>
+          <w:szCs w:val="22"/>
         </w:rPr>
         <w:t>Function reserveTable</w:t>
       </w:r>
@@ -219,24 +653,30 @@
           <w:rStyle w:val="Strong"/>
           <w:b w:val="0"/>
           <w:bCs w:val="0"/>
-        </w:rPr>
-        <w:t xml:space="preserve">() </w:t>
-      </w:r>
-      <w:r>
-        <w:rPr>
-          <w:rStyle w:val="Strong"/>
-          <w:b w:val="0"/>
-          <w:bCs w:val="0"/>
-        </w:rPr>
-        <w:t>with time parameter</w:t>
-      </w:r>
-      <w:r>
-        <w:rPr>
-          <w:rStyle w:val="Strong"/>
-          <w:b w:val="0"/>
-          <w:bCs w:val="0"/>
-        </w:rPr>
-        <w:t xml:space="preserve"> assigns input values from user as variables using DOM Manipulation, checks if user wrote data to input values, then creating an object newPerson and returns confirmation with user input data. After user can see own data, function cleans the input fields.</w:t>
+          <w:sz w:val="22"/>
+          <w:szCs w:val="22"/>
+        </w:rPr>
+        <w:t xml:space="preserve">() with time parameter assigns input values from user as variables using DOM Manipulation, checks if user wrote data to input values, then creating an object newPerson and returns confirmation with user input data. After </w:t>
+      </w:r>
+      <w:r>
+        <w:rPr>
+          <w:rStyle w:val="Strong"/>
+          <w:b w:val="0"/>
+          <w:bCs w:val="0"/>
+          <w:sz w:val="22"/>
+          <w:szCs w:val="22"/>
+        </w:rPr>
+        <w:t xml:space="preserve">display the </w:t>
+      </w:r>
+      <w:r>
+        <w:rPr>
+          <w:rStyle w:val="Strong"/>
+          <w:b w:val="0"/>
+          <w:bCs w:val="0"/>
+          <w:sz w:val="22"/>
+          <w:szCs w:val="22"/>
+        </w:rPr>
+        <w:t>data, function cleans the input fields.</w:t>
       </w:r>
     </w:p>
     <w:p>
@@ -258,8 +698,122 @@
           <w:rStyle w:val="Strong"/>
           <w:b w:val="0"/>
           <w:bCs w:val="0"/>
+          <w:sz w:val="22"/>
+          <w:szCs w:val="22"/>
         </w:rPr>
       </w:pPr>
+      <w:r>
+        <w:rPr>
+          <w:rStyle w:val="Strong"/>
+          <w:b w:val="0"/>
+          <w:bCs w:val="0"/>
+          <w:sz w:val="22"/>
+          <w:szCs w:val="22"/>
+        </w:rPr>
+        <w:t xml:space="preserve">Order page </w:t>
+      </w:r>
+      <w:r>
+        <w:rPr>
+          <w:rStyle w:val="Strong"/>
+          <w:b w:val="0"/>
+          <w:bCs w:val="0"/>
+          <w:sz w:val="22"/>
+          <w:szCs w:val="22"/>
+        </w:rPr>
+        <w:t xml:space="preserve">allows users to see the pizzas available at Pizza House and gives them an option to make an order and have them delivered. </w:t>
+      </w:r>
+      <w:r>
+        <w:rPr>
+          <w:rStyle w:val="Strong"/>
+          <w:b w:val="0"/>
+          <w:bCs w:val="0"/>
+          <w:sz w:val="22"/>
+          <w:szCs w:val="22"/>
+        </w:rPr>
+        <w:t>The pizzas are loaded dynamically with JavaScript so the menu can be easily updated without the need to change the code.</w:t>
+      </w:r>
+    </w:p>
+    <w:p>
+      <w:pPr>
+        <w:rPr>
+          <w:rStyle w:val="Strong"/>
+          <w:b w:val="0"/>
+          <w:bCs w:val="0"/>
+          <w:sz w:val="22"/>
+          <w:szCs w:val="22"/>
+        </w:rPr>
+      </w:pPr>
+      <w:r>
+        <w:rPr>
+          <w:rStyle w:val="Strong"/>
+          <w:b w:val="0"/>
+          <w:bCs w:val="0"/>
+          <w:sz w:val="22"/>
+          <w:szCs w:val="22"/>
+        </w:rPr>
+        <w:t>Use</w:t>
+      </w:r>
+      <w:r>
+        <w:rPr>
+          <w:rStyle w:val="Strong"/>
+          <w:b w:val="0"/>
+          <w:bCs w:val="0"/>
+          <w:sz w:val="22"/>
+          <w:szCs w:val="22"/>
+        </w:rPr>
+        <w:t>rs</w:t>
+      </w:r>
+      <w:r>
+        <w:rPr>
+          <w:rStyle w:val="Strong"/>
+          <w:b w:val="0"/>
+          <w:bCs w:val="0"/>
+          <w:sz w:val="22"/>
+          <w:szCs w:val="22"/>
+        </w:rPr>
+        <w:t xml:space="preserve"> can add a pizza to their cart by pressing the ‘Add to cart’ button. The pizzas are made in 3 sizes (small, medium and large) and users can choose which one they want. The prices updates accordingly to the chosen size</w:t>
+      </w:r>
+      <w:r>
+        <w:rPr>
+          <w:rStyle w:val="Strong"/>
+          <w:b w:val="0"/>
+          <w:bCs w:val="0"/>
+          <w:sz w:val="22"/>
+          <w:szCs w:val="22"/>
+        </w:rPr>
+        <w:t xml:space="preserve"> by adding and removing HTML Element representing the pizza.</w:t>
+      </w:r>
+    </w:p>
+    <w:p>
+      <w:pPr>
+        <w:rPr>
+          <w:rStyle w:val="Strong"/>
+          <w:b w:val="0"/>
+          <w:bCs w:val="0"/>
+          <w:sz w:val="22"/>
+          <w:szCs w:val="22"/>
+        </w:rPr>
+      </w:pPr>
+      <w:r>
+        <w:rPr>
+          <w:rStyle w:val="Strong"/>
+          <w:b w:val="0"/>
+          <w:bCs w:val="0"/>
+          <w:sz w:val="22"/>
+          <w:szCs w:val="22"/>
+        </w:rPr>
+        <w:t xml:space="preserve">When users make a mistake </w:t>
+      </w:r>
+      <w:r>
+        <w:rPr>
+          <w:rStyle w:val="Strong"/>
+          <w:b w:val="0"/>
+          <w:bCs w:val="0"/>
+          <w:sz w:val="22"/>
+          <w:szCs w:val="22"/>
+        </w:rPr>
+        <w:t>with their selection they can remove the pizza from the cart by clicking on it in the order summary section of the page. The total price is based on the pizzas in the cart.</w:t>
+      </w:r>
     </w:p>
     <w:sectPr>
       <w:pgSz w:w="12240" w:h="15840"/>
@@ -874,7 +1428,6 @@
   <w:style w:type="character" w:default="1" w:styleId="DefaultParagraphFont">
     <w:name w:val="Default Paragraph Font"/>
     <w:uiPriority w:val="1"/>
-    <w:semiHidden/>
     <w:unhideWhenUsed/>
   </w:style>
   <w:style w:type="table" w:default="1" w:styleId="TableNormal">
@@ -1197,6 +1750,29 @@
     <w:rPr>
       <w:b/>
       <w:bCs/>
+    </w:rPr>
+  </w:style>
+  <w:style w:type="character" w:styleId="Hyperlink">
+    <w:name w:val="Hyperlink"/>
+    <w:basedOn w:val="DefaultParagraphFont"/>
+    <w:uiPriority w:val="99"/>
+    <w:unhideWhenUsed/>
+    <w:rsid w:val="006A511B"/>
+    <w:rPr>
+      <w:color w:val="467886" w:themeColor="hyperlink"/>
+      <w:u w:val="single"/>
+    </w:rPr>
+  </w:style>
+  <w:style w:type="character" w:styleId="UnresolvedMention">
+    <w:name w:val="Unresolved Mention"/>
+    <w:basedOn w:val="DefaultParagraphFont"/>
+    <w:uiPriority w:val="99"/>
+    <w:semiHidden/>
+    <w:unhideWhenUsed/>
+    <w:rsid w:val="006A511B"/>
+    <w:rPr>
+      <w:color w:val="605E5C"/>
+      <w:shd w:val="clear" w:color="auto" w:fill="E1DFDD"/>
     </w:rPr>
   </w:style>
 </w:styles>

</xml_diff>